<commit_message>
added terms and contion & privacy policy popup page on the application
</commit_message>
<xml_diff>
--- a/PROJECT STRUCTURE DOCUMENTATION.docx
+++ b/PROJECT STRUCTURE DOCUMENTATION.docx
@@ -124,7 +124,6 @@
           <w:szCs w:val="36"/>
         </w:rPr>
       </w:pPr>
-      <w:proofErr w:type="gramStart"/>
       <w:r>
         <w:rPr>
           <w:rFonts w:ascii="Courier New" w:eastAsia="Times New Roman" w:hAnsi="Courier New" w:cs="Courier New"/>
@@ -133,65 +132,38 @@
           <w:kern w:val="0"/>
           <w:sz w:val="20"/>
         </w:rPr>
+        <w:t>public/</w:t>
+      </w:r>
+    </w:p>
+    <w:p>
+      <w:pPr>
+        <w:spacing w:before="100" w:beforeAutospacing="1" w:after="100" w:afterAutospacing="1" w:line="240" w:lineRule="auto"/>
+        <w:rPr>
+          <w:rFonts w:ascii="Times New Roman" w:eastAsia="Times New Roman" w:hAnsi="Times New Roman" w:cs="Times New Roman"/>
+          <w:kern w:val="0"/>
+        </w:rPr>
+      </w:pPr>
+      <w:r>
+        <w:rPr>
+          <w:rFonts w:ascii="Times New Roman" w:eastAsia="Times New Roman" w:hAnsi="Times New Roman" w:cs="Times New Roman"/>
+          <w:kern w:val="0"/>
+        </w:rPr>
+        <w:t xml:space="preserve">The </w:t>
+      </w:r>
+      <w:r>
+        <w:rPr>
+          <w:rFonts w:ascii="Courier New" w:eastAsia="Times New Roman" w:hAnsi="Courier New" w:cs="Courier New"/>
+          <w:kern w:val="0"/>
+          <w:sz w:val="20"/>
+        </w:rPr>
         <w:t>public</w:t>
       </w:r>
-      <w:proofErr w:type="gramEnd"/>
-      <w:r>
-        <w:rPr>
-          <w:rFonts w:ascii="Courier New" w:eastAsia="Times New Roman" w:hAnsi="Courier New" w:cs="Courier New"/>
-          <w:b/>
-          <w:bCs/>
-          <w:kern w:val="0"/>
-          <w:sz w:val="20"/>
-        </w:rPr>
-        <w:t>/</w:t>
-      </w:r>
-    </w:p>
-    <w:p>
-      <w:pPr>
-        <w:spacing w:before="100" w:beforeAutospacing="1" w:after="100" w:afterAutospacing="1" w:line="240" w:lineRule="auto"/>
-        <w:rPr>
-          <w:rFonts w:ascii="Times New Roman" w:eastAsia="Times New Roman" w:hAnsi="Times New Roman" w:cs="Times New Roman"/>
-          <w:kern w:val="0"/>
-        </w:rPr>
-      </w:pPr>
-      <w:r>
-        <w:rPr>
-          <w:rFonts w:ascii="Times New Roman" w:eastAsia="Times New Roman" w:hAnsi="Times New Roman" w:cs="Times New Roman"/>
-          <w:kern w:val="0"/>
-        </w:rPr>
-        <w:t xml:space="preserve">The </w:t>
-      </w:r>
-      <w:r>
-        <w:rPr>
-          <w:rFonts w:ascii="Courier New" w:eastAsia="Times New Roman" w:hAnsi="Courier New" w:cs="Courier New"/>
-          <w:kern w:val="0"/>
-          <w:sz w:val="20"/>
-        </w:rPr>
-        <w:t>public</w:t>
-      </w:r>
-      <w:r>
-        <w:rPr>
-          <w:rFonts w:ascii="Times New Roman" w:eastAsia="Times New Roman" w:hAnsi="Times New Roman" w:cs="Times New Roman"/>
-          <w:kern w:val="0"/>
-        </w:rPr>
-        <w:t xml:space="preserve"> folder contains all static files that are served directly by the browser without processing by </w:t>
-      </w:r>
-      <w:proofErr w:type="spellStart"/>
-      <w:r>
-        <w:rPr>
-          <w:rFonts w:ascii="Times New Roman" w:eastAsia="Times New Roman" w:hAnsi="Times New Roman" w:cs="Times New Roman"/>
-          <w:kern w:val="0"/>
-        </w:rPr>
-        <w:t>Webpack</w:t>
-      </w:r>
-      <w:proofErr w:type="spellEnd"/>
-      <w:r>
-        <w:rPr>
-          <w:rFonts w:ascii="Times New Roman" w:eastAsia="Times New Roman" w:hAnsi="Times New Roman" w:cs="Times New Roman"/>
-          <w:kern w:val="0"/>
-        </w:rPr>
-        <w:t xml:space="preserve"> or React.</w:t>
+      <w:r>
+        <w:rPr>
+          <w:rFonts w:ascii="Times New Roman" w:eastAsia="Times New Roman" w:hAnsi="Times New Roman" w:cs="Times New Roman"/>
+          <w:kern w:val="0"/>
+        </w:rPr>
+        <w:t xml:space="preserve"> folder contains all static files that are served directly by the browser without processing by Webpack or React.</w:t>
       </w:r>
     </w:p>
     <w:p>
@@ -405,7 +377,6 @@
           <w:kern w:val="0"/>
         </w:rPr>
       </w:pPr>
-      <w:proofErr w:type="spellStart"/>
       <w:r>
         <w:rPr>
           <w:rFonts w:ascii="Courier New" w:eastAsia="Times New Roman" w:hAnsi="Courier New" w:cs="Courier New"/>
@@ -414,7 +385,6 @@
         </w:rPr>
         <w:t>manifest.json</w:t>
       </w:r>
-      <w:proofErr w:type="spellEnd"/>
     </w:p>
     <w:p>
       <w:pPr>
@@ -535,7 +505,6 @@
         </w:rPr>
         <w:t xml:space="preserve">The </w:t>
       </w:r>
-      <w:proofErr w:type="spellStart"/>
       <w:r>
         <w:rPr>
           <w:rFonts w:ascii="Courier New" w:eastAsia="Times New Roman" w:hAnsi="Courier New" w:cs="Courier New"/>
@@ -544,7 +513,6 @@
         </w:rPr>
         <w:t>src</w:t>
       </w:r>
-      <w:proofErr w:type="spellEnd"/>
       <w:r>
         <w:rPr>
           <w:rFonts w:ascii="Times New Roman" w:eastAsia="Times New Roman" w:hAnsi="Times New Roman" w:cs="Times New Roman"/>
@@ -584,8 +552,6 @@
           <w:szCs w:val="36"/>
         </w:rPr>
       </w:pPr>
-      <w:proofErr w:type="spellStart"/>
-      <w:proofErr w:type="gramStart"/>
       <w:r>
         <w:rPr>
           <w:rFonts w:ascii="Courier New" w:eastAsia="Times New Roman" w:hAnsi="Courier New" w:cs="Courier New"/>
@@ -595,29 +561,7 @@
           <w:sz w:val="20"/>
         </w:rPr>
         <w:lastRenderedPageBreak/>
-        <w:t>src</w:t>
-      </w:r>
-      <w:proofErr w:type="spellEnd"/>
-      <w:r>
-        <w:rPr>
-          <w:rFonts w:ascii="Courier New" w:eastAsia="Times New Roman" w:hAnsi="Courier New" w:cs="Courier New"/>
-          <w:b/>
-          <w:bCs/>
-          <w:kern w:val="0"/>
-          <w:sz w:val="20"/>
-        </w:rPr>
-        <w:t>/assets</w:t>
-      </w:r>
-      <w:proofErr w:type="gramEnd"/>
-      <w:r>
-        <w:rPr>
-          <w:rFonts w:ascii="Courier New" w:eastAsia="Times New Roman" w:hAnsi="Courier New" w:cs="Courier New"/>
-          <w:b/>
-          <w:bCs/>
-          <w:kern w:val="0"/>
-          <w:sz w:val="20"/>
-        </w:rPr>
-        <w:t>/</w:t>
+        <w:t>src/assets/</w:t>
       </w:r>
     </w:p>
     <w:p>
@@ -828,8 +772,6 @@
           <w:szCs w:val="36"/>
         </w:rPr>
       </w:pPr>
-      <w:proofErr w:type="spellStart"/>
-      <w:proofErr w:type="gramStart"/>
       <w:r>
         <w:rPr>
           <w:rFonts w:ascii="Courier New" w:eastAsia="Times New Roman" w:hAnsi="Courier New" w:cs="Courier New"/>
@@ -838,40 +780,17 @@
           <w:kern w:val="0"/>
           <w:sz w:val="20"/>
         </w:rPr>
-        <w:t>src</w:t>
-      </w:r>
-      <w:proofErr w:type="spellEnd"/>
-      <w:r>
-        <w:rPr>
-          <w:rFonts w:ascii="Courier New" w:eastAsia="Times New Roman" w:hAnsi="Courier New" w:cs="Courier New"/>
-          <w:b/>
-          <w:bCs/>
-          <w:kern w:val="0"/>
-          <w:sz w:val="20"/>
-        </w:rPr>
-        <w:t>/chunks</w:t>
-      </w:r>
-      <w:proofErr w:type="gramEnd"/>
-      <w:r>
-        <w:rPr>
-          <w:rFonts w:ascii="Courier New" w:eastAsia="Times New Roman" w:hAnsi="Courier New" w:cs="Courier New"/>
-          <w:b/>
-          <w:bCs/>
-          <w:kern w:val="0"/>
-          <w:sz w:val="20"/>
-        </w:rPr>
-        <w:t>/</w:t>
-      </w:r>
-    </w:p>
-    <w:p>
-      <w:pPr>
-        <w:spacing w:before="100" w:beforeAutospacing="1" w:after="100" w:afterAutospacing="1" w:line="240" w:lineRule="auto"/>
-        <w:rPr>
-          <w:rFonts w:ascii="Times New Roman" w:eastAsia="Times New Roman" w:hAnsi="Times New Roman" w:cs="Times New Roman"/>
-          <w:kern w:val="0"/>
-        </w:rPr>
-      </w:pPr>
-      <w:proofErr w:type="gramStart"/>
+        <w:t>src/chunks/</w:t>
+      </w:r>
+    </w:p>
+    <w:p>
+      <w:pPr>
+        <w:spacing w:before="100" w:beforeAutospacing="1" w:after="100" w:afterAutospacing="1" w:line="240" w:lineRule="auto"/>
+        <w:rPr>
+          <w:rFonts w:ascii="Times New Roman" w:eastAsia="Times New Roman" w:hAnsi="Times New Roman" w:cs="Times New Roman"/>
+          <w:kern w:val="0"/>
+        </w:rPr>
+      </w:pPr>
       <w:r>
         <w:rPr>
           <w:rFonts w:ascii="Times New Roman" w:eastAsia="Times New Roman" w:hAnsi="Times New Roman" w:cs="Times New Roman"/>
@@ -879,7 +798,6 @@
         </w:rPr>
         <w:t>Contains modular page sections or reusable UI blocks.</w:t>
       </w:r>
-      <w:proofErr w:type="gramEnd"/>
     </w:p>
     <w:p>
       <w:pPr>
@@ -941,23 +859,7 @@
           <w:rFonts w:ascii="Times New Roman" w:eastAsia="Times New Roman" w:hAnsi="Times New Roman" w:cs="Times New Roman"/>
           <w:kern w:val="0"/>
         </w:rPr>
-        <w:t xml:space="preserve">Handles the </w:t>
-      </w:r>
-      <w:proofErr w:type="gramStart"/>
-      <w:r>
-        <w:rPr>
-          <w:rFonts w:ascii="Times New Roman" w:eastAsia="Times New Roman" w:hAnsi="Times New Roman" w:cs="Times New Roman"/>
-          <w:kern w:val="0"/>
-        </w:rPr>
-        <w:t>About</w:t>
-      </w:r>
-      <w:proofErr w:type="gramEnd"/>
-      <w:r>
-        <w:rPr>
-          <w:rFonts w:ascii="Times New Roman" w:eastAsia="Times New Roman" w:hAnsi="Times New Roman" w:cs="Times New Roman"/>
-          <w:kern w:val="0"/>
-        </w:rPr>
-        <w:t xml:space="preserve"> section displayed on the landing page.</w:t>
+        <w:t>Handles the About section displayed on the landing page.</w:t>
       </w:r>
     </w:p>
     <w:p>
@@ -990,7 +892,6 @@
           <w:kern w:val="0"/>
         </w:rPr>
       </w:pPr>
-      <w:proofErr w:type="gramStart"/>
       <w:r>
         <w:rPr>
           <w:rFonts w:ascii="Times New Roman" w:eastAsia="Times New Roman" w:hAnsi="Times New Roman" w:cs="Times New Roman"/>
@@ -998,7 +899,6 @@
         </w:rPr>
         <w:t>Displays achievements, milestones, or statistics.</w:t>
       </w:r>
-      <w:proofErr w:type="gramEnd"/>
     </w:p>
     <w:p>
       <w:pPr>
@@ -1011,7 +911,6 @@
           <w:kern w:val="0"/>
         </w:rPr>
       </w:pPr>
-      <w:proofErr w:type="spellStart"/>
       <w:r>
         <w:rPr>
           <w:rFonts w:ascii="Courier New" w:eastAsia="Times New Roman" w:hAnsi="Courier New" w:cs="Courier New"/>
@@ -1020,9 +919,36 @@
           <w:kern w:val="0"/>
           <w:sz w:val="20"/>
         </w:rPr>
-        <w:t>ContactLanding</w:t>
-      </w:r>
-      <w:proofErr w:type="spellEnd"/>
+        <w:t>ContactLanding...</w:t>
+      </w:r>
+    </w:p>
+    <w:p>
+      <w:pPr>
+        <w:spacing w:before="100" w:beforeAutospacing="1" w:after="100" w:afterAutospacing="1" w:line="240" w:lineRule="auto"/>
+        <w:rPr>
+          <w:rFonts w:ascii="Times New Roman" w:eastAsia="Times New Roman" w:hAnsi="Times New Roman" w:cs="Times New Roman"/>
+          <w:kern w:val="0"/>
+        </w:rPr>
+      </w:pPr>
+      <w:r>
+        <w:rPr>
+          <w:rFonts w:ascii="Times New Roman" w:eastAsia="Times New Roman" w:hAnsi="Times New Roman" w:cs="Times New Roman"/>
+          <w:kern w:val="0"/>
+        </w:rPr>
+        <w:t>Responsible for contact section UI and interactions.</w:t>
+      </w:r>
+    </w:p>
+    <w:p>
+      <w:pPr>
+        <w:spacing w:before="100" w:beforeAutospacing="1" w:after="100" w:afterAutospacing="1" w:line="240" w:lineRule="auto"/>
+        <w:outlineLvl w:val="3"/>
+        <w:rPr>
+          <w:rFonts w:ascii="Times New Roman" w:eastAsia="Times New Roman" w:hAnsi="Times New Roman" w:cs="Times New Roman"/>
+          <w:b/>
+          <w:bCs/>
+          <w:kern w:val="0"/>
+        </w:rPr>
+      </w:pPr>
       <w:r>
         <w:rPr>
           <w:rFonts w:ascii="Courier New" w:eastAsia="Times New Roman" w:hAnsi="Courier New" w:cs="Courier New"/>
@@ -1031,26 +957,24 @@
           <w:kern w:val="0"/>
           <w:sz w:val="20"/>
         </w:rPr>
-        <w:t>...</w:t>
-      </w:r>
-    </w:p>
-    <w:p>
-      <w:pPr>
-        <w:spacing w:before="100" w:beforeAutospacing="1" w:after="100" w:afterAutospacing="1" w:line="240" w:lineRule="auto"/>
-        <w:rPr>
-          <w:rFonts w:ascii="Times New Roman" w:eastAsia="Times New Roman" w:hAnsi="Times New Roman" w:cs="Times New Roman"/>
-          <w:kern w:val="0"/>
-        </w:rPr>
-      </w:pPr>
-      <w:proofErr w:type="gramStart"/>
-      <w:r>
-        <w:rPr>
-          <w:rFonts w:ascii="Times New Roman" w:eastAsia="Times New Roman" w:hAnsi="Times New Roman" w:cs="Times New Roman"/>
-          <w:kern w:val="0"/>
-        </w:rPr>
-        <w:t>Responsible for contact section UI and interactions.</w:t>
-      </w:r>
-      <w:proofErr w:type="gramEnd"/>
+        <w:t>FaqLanding.jsx</w:t>
+      </w:r>
+    </w:p>
+    <w:p>
+      <w:pPr>
+        <w:spacing w:before="100" w:beforeAutospacing="1" w:after="100" w:afterAutospacing="1" w:line="240" w:lineRule="auto"/>
+        <w:rPr>
+          <w:rFonts w:ascii="Times New Roman" w:eastAsia="Times New Roman" w:hAnsi="Times New Roman" w:cs="Times New Roman"/>
+          <w:kern w:val="0"/>
+        </w:rPr>
+      </w:pPr>
+      <w:r>
+        <w:rPr>
+          <w:rFonts w:ascii="Times New Roman" w:eastAsia="Times New Roman" w:hAnsi="Times New Roman" w:cs="Times New Roman"/>
+          <w:kern w:val="0"/>
+        </w:rPr>
+        <w:t>Handles Frequently Asked Questions section.</w:t>
+      </w:r>
     </w:p>
     <w:p>
       <w:pPr>
@@ -1071,26 +995,24 @@
           <w:kern w:val="0"/>
           <w:sz w:val="20"/>
         </w:rPr>
-        <w:t>FaqLanding.jsx</w:t>
-      </w:r>
-    </w:p>
-    <w:p>
-      <w:pPr>
-        <w:spacing w:before="100" w:beforeAutospacing="1" w:after="100" w:afterAutospacing="1" w:line="240" w:lineRule="auto"/>
-        <w:rPr>
-          <w:rFonts w:ascii="Times New Roman" w:eastAsia="Times New Roman" w:hAnsi="Times New Roman" w:cs="Times New Roman"/>
-          <w:kern w:val="0"/>
-        </w:rPr>
-      </w:pPr>
-      <w:proofErr w:type="gramStart"/>
-      <w:r>
-        <w:rPr>
-          <w:rFonts w:ascii="Times New Roman" w:eastAsia="Times New Roman" w:hAnsi="Times New Roman" w:cs="Times New Roman"/>
-          <w:kern w:val="0"/>
-        </w:rPr>
-        <w:t>Handles Frequently Asked Questions section.</w:t>
-      </w:r>
-      <w:proofErr w:type="gramEnd"/>
+        <w:t>Landing.jsx</w:t>
+      </w:r>
+    </w:p>
+    <w:p>
+      <w:pPr>
+        <w:spacing w:before="100" w:beforeAutospacing="1" w:after="100" w:afterAutospacing="1" w:line="240" w:lineRule="auto"/>
+        <w:rPr>
+          <w:rFonts w:ascii="Times New Roman" w:eastAsia="Times New Roman" w:hAnsi="Times New Roman" w:cs="Times New Roman"/>
+          <w:kern w:val="0"/>
+        </w:rPr>
+      </w:pPr>
+      <w:r>
+        <w:rPr>
+          <w:rFonts w:ascii="Times New Roman" w:eastAsia="Times New Roman" w:hAnsi="Times New Roman" w:cs="Times New Roman"/>
+          <w:kern w:val="0"/>
+        </w:rPr>
+        <w:t>Main landing or homepage section.</w:t>
+      </w:r>
     </w:p>
     <w:p>
       <w:pPr>
@@ -1111,26 +1033,24 @@
           <w:kern w:val="0"/>
           <w:sz w:val="20"/>
         </w:rPr>
-        <w:t>Landing.jsx</w:t>
-      </w:r>
-    </w:p>
-    <w:p>
-      <w:pPr>
-        <w:spacing w:before="100" w:beforeAutospacing="1" w:after="100" w:afterAutospacing="1" w:line="240" w:lineRule="auto"/>
-        <w:rPr>
-          <w:rFonts w:ascii="Times New Roman" w:eastAsia="Times New Roman" w:hAnsi="Times New Roman" w:cs="Times New Roman"/>
-          <w:kern w:val="0"/>
-        </w:rPr>
-      </w:pPr>
-      <w:proofErr w:type="gramStart"/>
-      <w:r>
-        <w:rPr>
-          <w:rFonts w:ascii="Times New Roman" w:eastAsia="Times New Roman" w:hAnsi="Times New Roman" w:cs="Times New Roman"/>
-          <w:kern w:val="0"/>
-        </w:rPr>
-        <w:t>Main landing or homepage section.</w:t>
-      </w:r>
-      <w:proofErr w:type="gramEnd"/>
+        <w:t>Maps.jsx</w:t>
+      </w:r>
+    </w:p>
+    <w:p>
+      <w:pPr>
+        <w:spacing w:before="100" w:beforeAutospacing="1" w:after="100" w:afterAutospacing="1" w:line="240" w:lineRule="auto"/>
+        <w:rPr>
+          <w:rFonts w:ascii="Times New Roman" w:eastAsia="Times New Roman" w:hAnsi="Times New Roman" w:cs="Times New Roman"/>
+          <w:kern w:val="0"/>
+        </w:rPr>
+      </w:pPr>
+      <w:r>
+        <w:rPr>
+          <w:rFonts w:ascii="Times New Roman" w:eastAsia="Times New Roman" w:hAnsi="Times New Roman" w:cs="Times New Roman"/>
+          <w:kern w:val="0"/>
+        </w:rPr>
+        <w:t>Contains map integrations or location display functionality.</w:t>
+      </w:r>
     </w:p>
     <w:p>
       <w:pPr>
@@ -1151,23 +1071,24 @@
           <w:kern w:val="0"/>
           <w:sz w:val="20"/>
         </w:rPr>
-        <w:t>Maps.jsx</w:t>
-      </w:r>
-    </w:p>
-    <w:p>
-      <w:pPr>
-        <w:spacing w:before="100" w:beforeAutospacing="1" w:after="100" w:afterAutospacing="1" w:line="240" w:lineRule="auto"/>
-        <w:rPr>
-          <w:rFonts w:ascii="Times New Roman" w:eastAsia="Times New Roman" w:hAnsi="Times New Roman" w:cs="Times New Roman"/>
-          <w:kern w:val="0"/>
-        </w:rPr>
-      </w:pPr>
-      <w:r>
-        <w:rPr>
-          <w:rFonts w:ascii="Times New Roman" w:eastAsia="Times New Roman" w:hAnsi="Times New Roman" w:cs="Times New Roman"/>
-          <w:kern w:val="0"/>
-        </w:rPr>
-        <w:t>Contains map integrations or location display functionality.</w:t>
+        <w:lastRenderedPageBreak/>
+        <w:t>ProjectsLanding...</w:t>
+      </w:r>
+    </w:p>
+    <w:p>
+      <w:pPr>
+        <w:spacing w:before="100" w:beforeAutospacing="1" w:after="100" w:afterAutospacing="1" w:line="240" w:lineRule="auto"/>
+        <w:rPr>
+          <w:rFonts w:ascii="Times New Roman" w:eastAsia="Times New Roman" w:hAnsi="Times New Roman" w:cs="Times New Roman"/>
+          <w:kern w:val="0"/>
+        </w:rPr>
+      </w:pPr>
+      <w:r>
+        <w:rPr>
+          <w:rFonts w:ascii="Times New Roman" w:eastAsia="Times New Roman" w:hAnsi="Times New Roman" w:cs="Times New Roman"/>
+          <w:kern w:val="0"/>
+        </w:rPr>
+        <w:t>Displays projects or portfolio-related content.</w:t>
       </w:r>
     </w:p>
     <w:p>
@@ -1181,7 +1102,6 @@
           <w:kern w:val="0"/>
         </w:rPr>
       </w:pPr>
-      <w:proofErr w:type="spellStart"/>
       <w:r>
         <w:rPr>
           <w:rFonts w:ascii="Courier New" w:eastAsia="Times New Roman" w:hAnsi="Courier New" w:cs="Courier New"/>
@@ -1190,10 +1110,36 @@
           <w:kern w:val="0"/>
           <w:sz w:val="20"/>
         </w:rPr>
-        <w:lastRenderedPageBreak/>
-        <w:t>ProjectsLanding</w:t>
-      </w:r>
-      <w:proofErr w:type="spellEnd"/>
+        <w:t>Socials.jsx</w:t>
+      </w:r>
+    </w:p>
+    <w:p>
+      <w:pPr>
+        <w:spacing w:before="100" w:beforeAutospacing="1" w:after="100" w:afterAutospacing="1" w:line="240" w:lineRule="auto"/>
+        <w:rPr>
+          <w:rFonts w:ascii="Times New Roman" w:eastAsia="Times New Roman" w:hAnsi="Times New Roman" w:cs="Times New Roman"/>
+          <w:kern w:val="0"/>
+        </w:rPr>
+      </w:pPr>
+      <w:r>
+        <w:rPr>
+          <w:rFonts w:ascii="Times New Roman" w:eastAsia="Times New Roman" w:hAnsi="Times New Roman" w:cs="Times New Roman"/>
+          <w:kern w:val="0"/>
+        </w:rPr>
+        <w:t>Handles social media links and integrations.</w:t>
+      </w:r>
+    </w:p>
+    <w:p>
+      <w:pPr>
+        <w:spacing w:before="100" w:beforeAutospacing="1" w:after="100" w:afterAutospacing="1" w:line="240" w:lineRule="auto"/>
+        <w:outlineLvl w:val="3"/>
+        <w:rPr>
+          <w:rFonts w:ascii="Times New Roman" w:eastAsia="Times New Roman" w:hAnsi="Times New Roman" w:cs="Times New Roman"/>
+          <w:b/>
+          <w:bCs/>
+          <w:kern w:val="0"/>
+        </w:rPr>
+      </w:pPr>
       <w:r>
         <w:rPr>
           <w:rFonts w:ascii="Courier New" w:eastAsia="Times New Roman" w:hAnsi="Courier New" w:cs="Courier New"/>
@@ -1202,110 +1148,17 @@
           <w:kern w:val="0"/>
           <w:sz w:val="20"/>
         </w:rPr>
-        <w:t>...</w:t>
-      </w:r>
-    </w:p>
-    <w:p>
-      <w:pPr>
-        <w:spacing w:before="100" w:beforeAutospacing="1" w:after="100" w:afterAutospacing="1" w:line="240" w:lineRule="auto"/>
-        <w:rPr>
-          <w:rFonts w:ascii="Times New Roman" w:eastAsia="Times New Roman" w:hAnsi="Times New Roman" w:cs="Times New Roman"/>
-          <w:kern w:val="0"/>
-        </w:rPr>
-      </w:pPr>
-      <w:proofErr w:type="gramStart"/>
-      <w:r>
-        <w:rPr>
-          <w:rFonts w:ascii="Times New Roman" w:eastAsia="Times New Roman" w:hAnsi="Times New Roman" w:cs="Times New Roman"/>
-          <w:kern w:val="0"/>
-        </w:rPr>
-        <w:t>Displays projects or portfolio-related content.</w:t>
-      </w:r>
-      <w:proofErr w:type="gramEnd"/>
-    </w:p>
-    <w:p>
-      <w:pPr>
-        <w:spacing w:before="100" w:beforeAutospacing="1" w:after="100" w:afterAutospacing="1" w:line="240" w:lineRule="auto"/>
-        <w:outlineLvl w:val="3"/>
-        <w:rPr>
-          <w:rFonts w:ascii="Times New Roman" w:eastAsia="Times New Roman" w:hAnsi="Times New Roman" w:cs="Times New Roman"/>
-          <w:b/>
-          <w:bCs/>
-          <w:kern w:val="0"/>
-        </w:rPr>
-      </w:pPr>
-      <w:r>
-        <w:rPr>
-          <w:rFonts w:ascii="Courier New" w:eastAsia="Times New Roman" w:hAnsi="Courier New" w:cs="Courier New"/>
-          <w:b/>
-          <w:bCs/>
-          <w:kern w:val="0"/>
-          <w:sz w:val="20"/>
-        </w:rPr>
-        <w:t>Socials.jsx</w:t>
-      </w:r>
-    </w:p>
-    <w:p>
-      <w:pPr>
-        <w:spacing w:before="100" w:beforeAutospacing="1" w:after="100" w:afterAutospacing="1" w:line="240" w:lineRule="auto"/>
-        <w:rPr>
-          <w:rFonts w:ascii="Times New Roman" w:eastAsia="Times New Roman" w:hAnsi="Times New Roman" w:cs="Times New Roman"/>
-          <w:kern w:val="0"/>
-        </w:rPr>
-      </w:pPr>
-      <w:proofErr w:type="gramStart"/>
-      <w:r>
-        <w:rPr>
-          <w:rFonts w:ascii="Times New Roman" w:eastAsia="Times New Roman" w:hAnsi="Times New Roman" w:cs="Times New Roman"/>
-          <w:kern w:val="0"/>
-        </w:rPr>
-        <w:t>Handles social media links and integrations.</w:t>
-      </w:r>
-      <w:proofErr w:type="gramEnd"/>
-    </w:p>
-    <w:p>
-      <w:pPr>
-        <w:spacing w:before="100" w:beforeAutospacing="1" w:after="100" w:afterAutospacing="1" w:line="240" w:lineRule="auto"/>
-        <w:outlineLvl w:val="3"/>
-        <w:rPr>
-          <w:rFonts w:ascii="Times New Roman" w:eastAsia="Times New Roman" w:hAnsi="Times New Roman" w:cs="Times New Roman"/>
-          <w:b/>
-          <w:bCs/>
-          <w:kern w:val="0"/>
-        </w:rPr>
-      </w:pPr>
-      <w:proofErr w:type="spellStart"/>
-      <w:r>
-        <w:rPr>
-          <w:rFonts w:ascii="Courier New" w:eastAsia="Times New Roman" w:hAnsi="Courier New" w:cs="Courier New"/>
-          <w:b/>
-          <w:bCs/>
-          <w:kern w:val="0"/>
-          <w:sz w:val="20"/>
-        </w:rPr>
-        <w:t>VolunteerLanding</w:t>
-      </w:r>
-      <w:proofErr w:type="spellEnd"/>
-      <w:r>
-        <w:rPr>
-          <w:rFonts w:ascii="Courier New" w:eastAsia="Times New Roman" w:hAnsi="Courier New" w:cs="Courier New"/>
-          <w:b/>
-          <w:bCs/>
-          <w:kern w:val="0"/>
-          <w:sz w:val="20"/>
-        </w:rPr>
-        <w:t>...</w:t>
-      </w:r>
-    </w:p>
-    <w:p>
-      <w:pPr>
-        <w:spacing w:before="100" w:beforeAutospacing="1" w:after="100" w:afterAutospacing="1" w:line="240" w:lineRule="auto"/>
-        <w:rPr>
-          <w:rFonts w:ascii="Times New Roman" w:eastAsia="Times New Roman" w:hAnsi="Times New Roman" w:cs="Times New Roman"/>
-          <w:kern w:val="0"/>
-        </w:rPr>
-      </w:pPr>
-      <w:proofErr w:type="gramStart"/>
+        <w:t>VolunteerLanding...</w:t>
+      </w:r>
+    </w:p>
+    <w:p>
+      <w:pPr>
+        <w:spacing w:before="100" w:beforeAutospacing="1" w:after="100" w:afterAutospacing="1" w:line="240" w:lineRule="auto"/>
+        <w:rPr>
+          <w:rFonts w:ascii="Times New Roman" w:eastAsia="Times New Roman" w:hAnsi="Times New Roman" w:cs="Times New Roman"/>
+          <w:kern w:val="0"/>
+        </w:rPr>
+      </w:pPr>
       <w:r>
         <w:rPr>
           <w:rFonts w:ascii="Times New Roman" w:eastAsia="Times New Roman" w:hAnsi="Times New Roman" w:cs="Times New Roman"/>
@@ -1313,7 +1166,6 @@
         </w:rPr>
         <w:t>Manages volunteer-related section or registration display.</w:t>
       </w:r>
-      <w:proofErr w:type="gramEnd"/>
     </w:p>
     <w:p>
       <w:pPr>
@@ -1382,8 +1234,6 @@
           <w:szCs w:val="36"/>
         </w:rPr>
       </w:pPr>
-      <w:proofErr w:type="spellStart"/>
-      <w:proofErr w:type="gramStart"/>
       <w:r>
         <w:rPr>
           <w:rFonts w:ascii="Courier New" w:eastAsia="Times New Roman" w:hAnsi="Courier New" w:cs="Courier New"/>
@@ -1392,40 +1242,17 @@
           <w:kern w:val="0"/>
           <w:sz w:val="20"/>
         </w:rPr>
-        <w:t>src</w:t>
-      </w:r>
-      <w:proofErr w:type="spellEnd"/>
-      <w:r>
-        <w:rPr>
-          <w:rFonts w:ascii="Courier New" w:eastAsia="Times New Roman" w:hAnsi="Courier New" w:cs="Courier New"/>
-          <w:b/>
-          <w:bCs/>
-          <w:kern w:val="0"/>
-          <w:sz w:val="20"/>
-        </w:rPr>
-        <w:t>/components</w:t>
-      </w:r>
-      <w:proofErr w:type="gramEnd"/>
-      <w:r>
-        <w:rPr>
-          <w:rFonts w:ascii="Courier New" w:eastAsia="Times New Roman" w:hAnsi="Courier New" w:cs="Courier New"/>
-          <w:b/>
-          <w:bCs/>
-          <w:kern w:val="0"/>
-          <w:sz w:val="20"/>
-        </w:rPr>
-        <w:t>/</w:t>
-      </w:r>
-    </w:p>
-    <w:p>
-      <w:pPr>
-        <w:spacing w:before="100" w:beforeAutospacing="1" w:after="100" w:afterAutospacing="1" w:line="240" w:lineRule="auto"/>
-        <w:rPr>
-          <w:rFonts w:ascii="Times New Roman" w:eastAsia="Times New Roman" w:hAnsi="Times New Roman" w:cs="Times New Roman"/>
-          <w:kern w:val="0"/>
-        </w:rPr>
-      </w:pPr>
-      <w:proofErr w:type="gramStart"/>
+        <w:t>src/components/</w:t>
+      </w:r>
+    </w:p>
+    <w:p>
+      <w:pPr>
+        <w:spacing w:before="100" w:beforeAutospacing="1" w:after="100" w:afterAutospacing="1" w:line="240" w:lineRule="auto"/>
+        <w:rPr>
+          <w:rFonts w:ascii="Times New Roman" w:eastAsia="Times New Roman" w:hAnsi="Times New Roman" w:cs="Times New Roman"/>
+          <w:kern w:val="0"/>
+        </w:rPr>
+      </w:pPr>
       <w:r>
         <w:rPr>
           <w:rFonts w:ascii="Times New Roman" w:eastAsia="Times New Roman" w:hAnsi="Times New Roman" w:cs="Times New Roman"/>
@@ -1433,7 +1260,6 @@
         </w:rPr>
         <w:t>Contains reusable UI components shared across different pages.</w:t>
       </w:r>
-      <w:proofErr w:type="gramEnd"/>
     </w:p>
     <w:p>
       <w:pPr>
@@ -1472,7 +1298,6 @@
           <w:kern w:val="0"/>
         </w:rPr>
       </w:pPr>
-      <w:proofErr w:type="spellStart"/>
       <w:r>
         <w:rPr>
           <w:rFonts w:ascii="Times New Roman" w:eastAsia="Times New Roman" w:hAnsi="Times New Roman" w:cs="Times New Roman"/>
@@ -1480,7 +1305,6 @@
         </w:rPr>
         <w:t>Navbar</w:t>
       </w:r>
-      <w:proofErr w:type="spellEnd"/>
     </w:p>
     <w:p>
       <w:pPr>
@@ -1584,6 +1408,26 @@
     </w:p>
     <w:p>
       <w:pPr>
+        <w:numPr>
+          <w:ilvl w:val="0"/>
+          <w:numId w:val="5"/>
+        </w:numPr>
+        <w:spacing w:before="100" w:beforeAutospacing="1" w:after="100" w:afterAutospacing="1" w:line="240" w:lineRule="auto"/>
+        <w:rPr>
+          <w:rFonts w:ascii="Times New Roman" w:eastAsia="Times New Roman" w:hAnsi="Times New Roman" w:cs="Times New Roman"/>
+          <w:kern w:val="0"/>
+        </w:rPr>
+      </w:pPr>
+      <w:r>
+        <w:rPr>
+          <w:rFonts w:ascii="Times New Roman" w:eastAsia="Times New Roman" w:hAnsi="Times New Roman" w:cs="Times New Roman"/>
+          <w:kern w:val="0"/>
+        </w:rPr>
+        <w:t>Terms and condition popup</w:t>
+      </w:r>
+    </w:p>
+    <w:p>
+      <w:pPr>
         <w:spacing w:before="100" w:beforeAutospacing="1" w:after="100" w:afterAutospacing="1" w:line="240" w:lineRule="auto"/>
         <w:rPr>
           <w:rFonts w:ascii="Times New Roman" w:eastAsia="Times New Roman" w:hAnsi="Times New Roman" w:cs="Times New Roman"/>
@@ -1649,8 +1493,6 @@
           <w:szCs w:val="36"/>
         </w:rPr>
       </w:pPr>
-      <w:proofErr w:type="spellStart"/>
-      <w:proofErr w:type="gramStart"/>
       <w:r>
         <w:rPr>
           <w:rFonts w:ascii="Courier New" w:eastAsia="Times New Roman" w:hAnsi="Courier New" w:cs="Courier New"/>
@@ -1659,40 +1501,17 @@
           <w:kern w:val="0"/>
           <w:sz w:val="20"/>
         </w:rPr>
-        <w:t>src</w:t>
-      </w:r>
-      <w:proofErr w:type="spellEnd"/>
-      <w:r>
-        <w:rPr>
-          <w:rFonts w:ascii="Courier New" w:eastAsia="Times New Roman" w:hAnsi="Courier New" w:cs="Courier New"/>
-          <w:b/>
-          <w:bCs/>
-          <w:kern w:val="0"/>
-          <w:sz w:val="20"/>
-        </w:rPr>
-        <w:t>/routes</w:t>
-      </w:r>
-      <w:proofErr w:type="gramEnd"/>
-      <w:r>
-        <w:rPr>
-          <w:rFonts w:ascii="Courier New" w:eastAsia="Times New Roman" w:hAnsi="Courier New" w:cs="Courier New"/>
-          <w:b/>
-          <w:bCs/>
-          <w:kern w:val="0"/>
-          <w:sz w:val="20"/>
-        </w:rPr>
-        <w:t>/</w:t>
-      </w:r>
-    </w:p>
-    <w:p>
-      <w:pPr>
-        <w:spacing w:before="100" w:beforeAutospacing="1" w:after="100" w:afterAutospacing="1" w:line="240" w:lineRule="auto"/>
-        <w:rPr>
-          <w:rFonts w:ascii="Times New Roman" w:eastAsia="Times New Roman" w:hAnsi="Times New Roman" w:cs="Times New Roman"/>
-          <w:kern w:val="0"/>
-        </w:rPr>
-      </w:pPr>
-      <w:proofErr w:type="gramStart"/>
+        <w:t>src/routes/</w:t>
+      </w:r>
+    </w:p>
+    <w:p>
+      <w:pPr>
+        <w:spacing w:before="100" w:beforeAutospacing="1" w:after="100" w:afterAutospacing="1" w:line="240" w:lineRule="auto"/>
+        <w:rPr>
+          <w:rFonts w:ascii="Times New Roman" w:eastAsia="Times New Roman" w:hAnsi="Times New Roman" w:cs="Times New Roman"/>
+          <w:kern w:val="0"/>
+        </w:rPr>
+      </w:pPr>
       <w:r>
         <w:rPr>
           <w:rFonts w:ascii="Times New Roman" w:eastAsia="Times New Roman" w:hAnsi="Times New Roman" w:cs="Times New Roman"/>
@@ -1700,7 +1519,6 @@
         </w:rPr>
         <w:t>Handles application routing configuration.</w:t>
       </w:r>
-      <w:proofErr w:type="gramEnd"/>
     </w:p>
     <w:p>
       <w:pPr>
@@ -1771,6 +1589,7 @@
           <w:rFonts w:ascii="Times New Roman" w:eastAsia="Times New Roman" w:hAnsi="Times New Roman" w:cs="Times New Roman"/>
           <w:kern w:val="0"/>
         </w:rPr>
+        <w:lastRenderedPageBreak/>
         <w:pict>
           <v:rect id="_x0000_i1031" style="width:0;height:1.5pt" o:hralign="center" o:hrstd="t" o:hr="t" fillcolor="#a0a0a0" stroked="f"/>
         </w:pict>
@@ -1789,8 +1608,6 @@
           <w:szCs w:val="36"/>
         </w:rPr>
       </w:pPr>
-      <w:proofErr w:type="spellStart"/>
-      <w:proofErr w:type="gramStart"/>
       <w:r>
         <w:rPr>
           <w:rFonts w:ascii="Courier New" w:eastAsia="Times New Roman" w:hAnsi="Courier New" w:cs="Courier New"/>
@@ -1799,41 +1616,17 @@
           <w:kern w:val="0"/>
           <w:sz w:val="20"/>
         </w:rPr>
-        <w:lastRenderedPageBreak/>
-        <w:t>src</w:t>
-      </w:r>
-      <w:proofErr w:type="spellEnd"/>
-      <w:r>
-        <w:rPr>
-          <w:rFonts w:ascii="Courier New" w:eastAsia="Times New Roman" w:hAnsi="Courier New" w:cs="Courier New"/>
-          <w:b/>
-          <w:bCs/>
-          <w:kern w:val="0"/>
-          <w:sz w:val="20"/>
-        </w:rPr>
-        <w:t>/services</w:t>
-      </w:r>
-      <w:proofErr w:type="gramEnd"/>
-      <w:r>
-        <w:rPr>
-          <w:rFonts w:ascii="Courier New" w:eastAsia="Times New Roman" w:hAnsi="Courier New" w:cs="Courier New"/>
-          <w:b/>
-          <w:bCs/>
-          <w:kern w:val="0"/>
-          <w:sz w:val="20"/>
-        </w:rPr>
-        <w:t>/</w:t>
-      </w:r>
-    </w:p>
-    <w:p>
-      <w:pPr>
-        <w:spacing w:before="100" w:beforeAutospacing="1" w:after="100" w:afterAutospacing="1" w:line="240" w:lineRule="auto"/>
-        <w:rPr>
-          <w:rFonts w:ascii="Times New Roman" w:eastAsia="Times New Roman" w:hAnsi="Times New Roman" w:cs="Times New Roman"/>
-          <w:kern w:val="0"/>
-        </w:rPr>
-      </w:pPr>
-      <w:proofErr w:type="gramStart"/>
+        <w:t>src/services/</w:t>
+      </w:r>
+    </w:p>
+    <w:p>
+      <w:pPr>
+        <w:spacing w:before="100" w:beforeAutospacing="1" w:after="100" w:afterAutospacing="1" w:line="240" w:lineRule="auto"/>
+        <w:rPr>
+          <w:rFonts w:ascii="Times New Roman" w:eastAsia="Times New Roman" w:hAnsi="Times New Roman" w:cs="Times New Roman"/>
+          <w:kern w:val="0"/>
+        </w:rPr>
+      </w:pPr>
       <w:r>
         <w:rPr>
           <w:rFonts w:ascii="Times New Roman" w:eastAsia="Times New Roman" w:hAnsi="Times New Roman" w:cs="Times New Roman"/>
@@ -1841,7 +1634,6 @@
         </w:rPr>
         <w:t>Contains business logic, API calls, and external service integrations.</w:t>
       </w:r>
-      <w:proofErr w:type="gramEnd"/>
     </w:p>
     <w:p>
       <w:pPr>
@@ -1898,7 +1690,6 @@
           <w:kern w:val="0"/>
         </w:rPr>
       </w:pPr>
-      <w:proofErr w:type="gramStart"/>
       <w:r>
         <w:rPr>
           <w:rFonts w:ascii="Times New Roman" w:eastAsia="Times New Roman" w:hAnsi="Times New Roman" w:cs="Times New Roman"/>
@@ -1906,7 +1697,6 @@
         </w:rPr>
         <w:t>Stores global application data or shared constants.</w:t>
       </w:r>
-      <w:proofErr w:type="gramEnd"/>
     </w:p>
     <w:p>
       <w:pPr>
@@ -1919,7 +1709,6 @@
           <w:kern w:val="0"/>
         </w:rPr>
       </w:pPr>
-      <w:proofErr w:type="spellStart"/>
       <w:r>
         <w:rPr>
           <w:rFonts w:ascii="Courier New" w:eastAsia="Times New Roman" w:hAnsi="Courier New" w:cs="Courier New"/>
@@ -1928,9 +1717,36 @@
           <w:kern w:val="0"/>
           <w:sz w:val="20"/>
         </w:rPr>
-        <w:t>GlobalFunctions</w:t>
-      </w:r>
-      <w:proofErr w:type="spellEnd"/>
+        <w:t>GlobalFunctions...</w:t>
+      </w:r>
+    </w:p>
+    <w:p>
+      <w:pPr>
+        <w:spacing w:before="100" w:beforeAutospacing="1" w:after="100" w:afterAutospacing="1" w:line="240" w:lineRule="auto"/>
+        <w:rPr>
+          <w:rFonts w:ascii="Times New Roman" w:eastAsia="Times New Roman" w:hAnsi="Times New Roman" w:cs="Times New Roman"/>
+          <w:kern w:val="0"/>
+        </w:rPr>
+      </w:pPr>
+      <w:r>
+        <w:rPr>
+          <w:rFonts w:ascii="Times New Roman" w:eastAsia="Times New Roman" w:hAnsi="Times New Roman" w:cs="Times New Roman"/>
+          <w:kern w:val="0"/>
+        </w:rPr>
+        <w:t>Contains reusable utility functions.</w:t>
+      </w:r>
+    </w:p>
+    <w:p>
+      <w:pPr>
+        <w:spacing w:before="100" w:beforeAutospacing="1" w:after="100" w:afterAutospacing="1" w:line="240" w:lineRule="auto"/>
+        <w:outlineLvl w:val="3"/>
+        <w:rPr>
+          <w:rFonts w:ascii="Times New Roman" w:eastAsia="Times New Roman" w:hAnsi="Times New Roman" w:cs="Times New Roman"/>
+          <w:b/>
+          <w:bCs/>
+          <w:kern w:val="0"/>
+        </w:rPr>
+      </w:pPr>
       <w:r>
         <w:rPr>
           <w:rFonts w:ascii="Courier New" w:eastAsia="Times New Roman" w:hAnsi="Courier New" w:cs="Courier New"/>
@@ -1939,44 +1755,6 @@
           <w:kern w:val="0"/>
           <w:sz w:val="20"/>
         </w:rPr>
-        <w:t>...</w:t>
-      </w:r>
-    </w:p>
-    <w:p>
-      <w:pPr>
-        <w:spacing w:before="100" w:beforeAutospacing="1" w:after="100" w:afterAutospacing="1" w:line="240" w:lineRule="auto"/>
-        <w:rPr>
-          <w:rFonts w:ascii="Times New Roman" w:eastAsia="Times New Roman" w:hAnsi="Times New Roman" w:cs="Times New Roman"/>
-          <w:kern w:val="0"/>
-        </w:rPr>
-      </w:pPr>
-      <w:r>
-        <w:rPr>
-          <w:rFonts w:ascii="Times New Roman" w:eastAsia="Times New Roman" w:hAnsi="Times New Roman" w:cs="Times New Roman"/>
-          <w:kern w:val="0"/>
-        </w:rPr>
-        <w:t>Contains reusable utility functions.</w:t>
-      </w:r>
-    </w:p>
-    <w:p>
-      <w:pPr>
-        <w:spacing w:before="100" w:beforeAutospacing="1" w:after="100" w:afterAutospacing="1" w:line="240" w:lineRule="auto"/>
-        <w:outlineLvl w:val="3"/>
-        <w:rPr>
-          <w:rFonts w:ascii="Times New Roman" w:eastAsia="Times New Roman" w:hAnsi="Times New Roman" w:cs="Times New Roman"/>
-          <w:b/>
-          <w:bCs/>
-          <w:kern w:val="0"/>
-        </w:rPr>
-      </w:pPr>
-      <w:r>
-        <w:rPr>
-          <w:rFonts w:ascii="Courier New" w:eastAsia="Times New Roman" w:hAnsi="Courier New" w:cs="Courier New"/>
-          <w:b/>
-          <w:bCs/>
-          <w:kern w:val="0"/>
-          <w:sz w:val="20"/>
-        </w:rPr>
         <w:t>server.js</w:t>
       </w:r>
     </w:p>
@@ -1988,7 +1766,6 @@
           <w:kern w:val="0"/>
         </w:rPr>
       </w:pPr>
-      <w:proofErr w:type="gramStart"/>
       <w:r>
         <w:rPr>
           <w:rFonts w:ascii="Times New Roman" w:eastAsia="Times New Roman" w:hAnsi="Times New Roman" w:cs="Times New Roman"/>
@@ -1996,7 +1773,6 @@
         </w:rPr>
         <w:t>Handles API configuration or backend communication logic.</w:t>
       </w:r>
-      <w:proofErr w:type="gramEnd"/>
     </w:p>
     <w:p>
       <w:pPr>
@@ -2129,31 +1905,13 @@
           <w:kern w:val="0"/>
         </w:rPr>
       </w:pPr>
-      <w:proofErr w:type="gramStart"/>
-      <w:r>
-        <w:rPr>
-          <w:rFonts w:ascii="Times New Roman" w:eastAsia="Times New Roman" w:hAnsi="Times New Roman" w:cs="Times New Roman"/>
-          <w:kern w:val="0"/>
-        </w:rPr>
-        <w:t xml:space="preserve">Main </w:t>
-      </w:r>
-      <w:proofErr w:type="spellStart"/>
-      <w:r>
-        <w:rPr>
-          <w:rFonts w:ascii="Times New Roman" w:eastAsia="Times New Roman" w:hAnsi="Times New Roman" w:cs="Times New Roman"/>
-          <w:kern w:val="0"/>
-        </w:rPr>
-        <w:t>stylesheet</w:t>
-      </w:r>
-      <w:proofErr w:type="spellEnd"/>
-      <w:r>
-        <w:rPr>
-          <w:rFonts w:ascii="Times New Roman" w:eastAsia="Times New Roman" w:hAnsi="Times New Roman" w:cs="Times New Roman"/>
-          <w:kern w:val="0"/>
-        </w:rPr>
-        <w:t xml:space="preserve"> for the application.</w:t>
-      </w:r>
-      <w:proofErr w:type="gramEnd"/>
+      <w:r>
+        <w:rPr>
+          <w:rFonts w:ascii="Times New Roman" w:eastAsia="Times New Roman" w:hAnsi="Times New Roman" w:cs="Times New Roman"/>
+          <w:kern w:val="0"/>
+        </w:rPr>
+        <w:t>Main stylesheet for the application.</w:t>
+      </w:r>
     </w:p>
     <w:p>
       <w:pPr>
@@ -2300,7 +2058,6 @@
           <w:szCs w:val="36"/>
         </w:rPr>
       </w:pPr>
-      <w:proofErr w:type="spellStart"/>
       <w:r>
         <w:rPr>
           <w:rFonts w:ascii="Courier New" w:eastAsia="Times New Roman" w:hAnsi="Courier New" w:cs="Courier New"/>
@@ -2309,28 +2066,25 @@
           <w:kern w:val="0"/>
           <w:sz w:val="20"/>
         </w:rPr>
+        <w:lastRenderedPageBreak/>
         <w:t>App.test.js</w:t>
       </w:r>
-      <w:proofErr w:type="spellEnd"/>
-    </w:p>
-    <w:p>
-      <w:pPr>
-        <w:spacing w:before="100" w:beforeAutospacing="1" w:after="100" w:afterAutospacing="1" w:line="240" w:lineRule="auto"/>
-        <w:rPr>
-          <w:rFonts w:ascii="Times New Roman" w:eastAsia="Times New Roman" w:hAnsi="Times New Roman" w:cs="Times New Roman"/>
-          <w:kern w:val="0"/>
-        </w:rPr>
-      </w:pPr>
-      <w:proofErr w:type="gramStart"/>
-      <w:r>
-        <w:rPr>
-          <w:rFonts w:ascii="Times New Roman" w:eastAsia="Times New Roman" w:hAnsi="Times New Roman" w:cs="Times New Roman"/>
-          <w:kern w:val="0"/>
-        </w:rPr>
-        <w:lastRenderedPageBreak/>
+    </w:p>
+    <w:p>
+      <w:pPr>
+        <w:spacing w:before="100" w:beforeAutospacing="1" w:after="100" w:afterAutospacing="1" w:line="240" w:lineRule="auto"/>
+        <w:rPr>
+          <w:rFonts w:ascii="Times New Roman" w:eastAsia="Times New Roman" w:hAnsi="Times New Roman" w:cs="Times New Roman"/>
+          <w:kern w:val="0"/>
+        </w:rPr>
+      </w:pPr>
+      <w:r>
+        <w:rPr>
+          <w:rFonts w:ascii="Times New Roman" w:eastAsia="Times New Roman" w:hAnsi="Times New Roman" w:cs="Times New Roman"/>
+          <w:kern w:val="0"/>
+        </w:rPr>
         <w:t>Contains unit tests for the application.</w:t>
       </w:r>
-      <w:proofErr w:type="gramEnd"/>
     </w:p>
     <w:p>
       <w:pPr>
@@ -2382,7 +2136,6 @@
           <w:kern w:val="0"/>
         </w:rPr>
       </w:pPr>
-      <w:proofErr w:type="gramStart"/>
       <w:r>
         <w:rPr>
           <w:rFonts w:ascii="Times New Roman" w:eastAsia="Times New Roman" w:hAnsi="Times New Roman" w:cs="Times New Roman"/>
@@ -2390,7 +2143,6 @@
         </w:rPr>
         <w:t>Handles caching logic for improved performance and offline capabilities.</w:t>
       </w:r>
-      <w:proofErr w:type="gramEnd"/>
     </w:p>
     <w:p>
       <w:pPr>
@@ -2500,7 +2252,6 @@
           <w:kern w:val="0"/>
         </w:rPr>
       </w:pPr>
-      <w:proofErr w:type="gramStart"/>
       <w:r>
         <w:rPr>
           <w:rFonts w:ascii="Times New Roman" w:eastAsia="Times New Roman" w:hAnsi="Times New Roman" w:cs="Times New Roman"/>
@@ -2508,7 +2259,6 @@
         </w:rPr>
         <w:t>Main React entry point.</w:t>
       </w:r>
-      <w:proofErr w:type="gramEnd"/>
     </w:p>
     <w:p>
       <w:pPr>
@@ -2674,7 +2424,6 @@
           <w:kern w:val="0"/>
         </w:rPr>
       </w:pPr>
-      <w:proofErr w:type="gramStart"/>
       <w:r>
         <w:rPr>
           <w:rFonts w:ascii="Times New Roman" w:eastAsia="Times New Roman" w:hAnsi="Times New Roman" w:cs="Times New Roman"/>
@@ -2682,7 +2431,6 @@
         </w:rPr>
         <w:t>Fallback component for undefined routes (404 Page).</w:t>
       </w:r>
-      <w:proofErr w:type="gramEnd"/>
     </w:p>
     <w:p>
       <w:pPr>
@@ -2734,7 +2482,6 @@
           <w:kern w:val="0"/>
         </w:rPr>
       </w:pPr>
-      <w:proofErr w:type="gramStart"/>
       <w:r>
         <w:rPr>
           <w:rFonts w:ascii="Times New Roman" w:eastAsia="Times New Roman" w:hAnsi="Times New Roman" w:cs="Times New Roman"/>
@@ -2742,7 +2489,6 @@
         </w:rPr>
         <w:t>Tracks application performance metrics.</w:t>
       </w:r>
-      <w:proofErr w:type="gramEnd"/>
     </w:p>
     <w:p>
       <w:pPr>
@@ -2775,7 +2521,6 @@
           <w:szCs w:val="36"/>
         </w:rPr>
       </w:pPr>
-      <w:proofErr w:type="gramStart"/>
       <w:r>
         <w:rPr>
           <w:rFonts w:ascii="Courier New" w:eastAsia="Times New Roman" w:hAnsi="Courier New" w:cs="Courier New"/>
@@ -2786,17 +2531,15 @@
         </w:rPr>
         <w:t>service-worker.js</w:t>
       </w:r>
-      <w:proofErr w:type="gramEnd"/>
-    </w:p>
-    <w:p>
-      <w:pPr>
-        <w:spacing w:before="100" w:beforeAutospacing="1" w:after="100" w:afterAutospacing="1" w:line="240" w:lineRule="auto"/>
-        <w:rPr>
-          <w:rFonts w:ascii="Times New Roman" w:eastAsia="Times New Roman" w:hAnsi="Times New Roman" w:cs="Times New Roman"/>
-          <w:kern w:val="0"/>
-        </w:rPr>
-      </w:pPr>
-      <w:proofErr w:type="gramStart"/>
+    </w:p>
+    <w:p>
+      <w:pPr>
+        <w:spacing w:before="100" w:beforeAutospacing="1" w:after="100" w:afterAutospacing="1" w:line="240" w:lineRule="auto"/>
+        <w:rPr>
+          <w:rFonts w:ascii="Times New Roman" w:eastAsia="Times New Roman" w:hAnsi="Times New Roman" w:cs="Times New Roman"/>
+          <w:kern w:val="0"/>
+        </w:rPr>
+      </w:pPr>
       <w:r>
         <w:rPr>
           <w:rFonts w:ascii="Times New Roman" w:eastAsia="Times New Roman" w:hAnsi="Times New Roman" w:cs="Times New Roman"/>
@@ -2805,7 +2548,6 @@
         <w:lastRenderedPageBreak/>
         <w:t>Handles offline support and caching using service workers.</w:t>
       </w:r>
-      <w:proofErr w:type="gramEnd"/>
     </w:p>
     <w:p>
       <w:pPr>
@@ -2857,7 +2599,6 @@
           <w:kern w:val="0"/>
         </w:rPr>
       </w:pPr>
-      <w:proofErr w:type="gramStart"/>
       <w:r>
         <w:rPr>
           <w:rFonts w:ascii="Times New Roman" w:eastAsia="Times New Roman" w:hAnsi="Times New Roman" w:cs="Times New Roman"/>
@@ -2865,7 +2606,6 @@
         </w:rPr>
         <w:t>Registers the service worker for Progressive Web App functionality.</w:t>
       </w:r>
-      <w:proofErr w:type="gramEnd"/>
     </w:p>
     <w:p>
       <w:pPr>
@@ -2917,7 +2657,6 @@
           <w:kern w:val="0"/>
         </w:rPr>
       </w:pPr>
-      <w:proofErr w:type="gramStart"/>
       <w:r>
         <w:rPr>
           <w:rFonts w:ascii="Times New Roman" w:eastAsia="Times New Roman" w:hAnsi="Times New Roman" w:cs="Times New Roman"/>
@@ -2925,7 +2664,6 @@
         </w:rPr>
         <w:t>Configuration setup for testing environment.</w:t>
       </w:r>
-      <w:proofErr w:type="gramEnd"/>
     </w:p>
     <w:p>
       <w:pPr>
@@ -2991,9 +2729,8 @@
           <w:kern w:val="0"/>
           <w:sz w:val="20"/>
         </w:rPr>
-        <w:t>.</w:t>
-      </w:r>
-      <w:proofErr w:type="spellStart"/>
+        <w:t>.env</w:t>
+      </w:r>
       <w:r>
         <w:rPr>
           <w:rFonts w:ascii="Courier New" w:eastAsia="Times New Roman" w:hAnsi="Courier New" w:cs="Courier New"/>
@@ -3002,17 +2739,6 @@
           <w:kern w:val="0"/>
           <w:sz w:val="20"/>
         </w:rPr>
-        <w:t>env</w:t>
-      </w:r>
-      <w:proofErr w:type="spellEnd"/>
-      <w:r>
-        <w:rPr>
-          <w:rFonts w:ascii="Courier New" w:eastAsia="Times New Roman" w:hAnsi="Courier New" w:cs="Courier New"/>
-          <w:b/>
-          <w:bCs/>
-          <w:kern w:val="0"/>
-          <w:sz w:val="20"/>
-        </w:rPr>
         <w:t xml:space="preserve"> file</w:t>
       </w:r>
     </w:p>
@@ -3024,7 +2750,6 @@
           <w:kern w:val="0"/>
         </w:rPr>
       </w:pPr>
-      <w:proofErr w:type="gramStart"/>
       <w:r>
         <w:rPr>
           <w:rFonts w:ascii="Times New Roman" w:eastAsia="Times New Roman" w:hAnsi="Times New Roman" w:cs="Times New Roman"/>
@@ -3032,7 +2757,6 @@
         </w:rPr>
         <w:t>Stores environment variables.</w:t>
       </w:r>
-      <w:proofErr w:type="gramEnd"/>
     </w:p>
     <w:p>
       <w:pPr>
@@ -3185,54 +2909,24 @@
           <w:kern w:val="0"/>
           <w:sz w:val="20"/>
         </w:rPr>
-        <w:t>.</w:t>
-      </w:r>
-      <w:proofErr w:type="spellStart"/>
-      <w:r>
-        <w:rPr>
-          <w:rFonts w:ascii="Courier New" w:eastAsia="Times New Roman" w:hAnsi="Courier New" w:cs="Courier New"/>
-          <w:b/>
-          <w:bCs/>
-          <w:kern w:val="0"/>
-          <w:sz w:val="20"/>
-        </w:rPr>
-        <w:t>gitignore</w:t>
-      </w:r>
-      <w:proofErr w:type="spellEnd"/>
-    </w:p>
-    <w:p>
-      <w:pPr>
-        <w:spacing w:before="100" w:beforeAutospacing="1" w:after="100" w:afterAutospacing="1" w:line="240" w:lineRule="auto"/>
-        <w:rPr>
-          <w:rFonts w:ascii="Times New Roman" w:eastAsia="Times New Roman" w:hAnsi="Times New Roman" w:cs="Times New Roman"/>
-          <w:kern w:val="0"/>
-        </w:rPr>
-      </w:pPr>
-      <w:proofErr w:type="gramStart"/>
-      <w:r>
-        <w:rPr>
-          <w:rFonts w:ascii="Times New Roman" w:eastAsia="Times New Roman" w:hAnsi="Times New Roman" w:cs="Times New Roman"/>
-          <w:kern w:val="0"/>
-        </w:rPr>
-        <w:t xml:space="preserve">Defines files and folders ignored by </w:t>
-      </w:r>
-      <w:proofErr w:type="spellStart"/>
-      <w:r>
-        <w:rPr>
-          <w:rFonts w:ascii="Times New Roman" w:eastAsia="Times New Roman" w:hAnsi="Times New Roman" w:cs="Times New Roman"/>
-          <w:kern w:val="0"/>
-        </w:rPr>
-        <w:t>Git</w:t>
-      </w:r>
-      <w:proofErr w:type="spellEnd"/>
-      <w:r>
-        <w:rPr>
-          <w:rFonts w:ascii="Times New Roman" w:eastAsia="Times New Roman" w:hAnsi="Times New Roman" w:cs="Times New Roman"/>
-          <w:kern w:val="0"/>
-        </w:rPr>
-        <w:t xml:space="preserve"> version control.</w:t>
-      </w:r>
-      <w:proofErr w:type="gramEnd"/>
+        <w:t>.gitignore</w:t>
+      </w:r>
+    </w:p>
+    <w:p>
+      <w:pPr>
+        <w:spacing w:before="100" w:beforeAutospacing="1" w:after="100" w:afterAutospacing="1" w:line="240" w:lineRule="auto"/>
+        <w:rPr>
+          <w:rFonts w:ascii="Times New Roman" w:eastAsia="Times New Roman" w:hAnsi="Times New Roman" w:cs="Times New Roman"/>
+          <w:kern w:val="0"/>
+        </w:rPr>
+      </w:pPr>
+      <w:r>
+        <w:rPr>
+          <w:rFonts w:ascii="Times New Roman" w:eastAsia="Times New Roman" w:hAnsi="Times New Roman" w:cs="Times New Roman"/>
+          <w:kern w:val="0"/>
+        </w:rPr>
+        <w:t>Defines files and folders ignored by Git version control.</w:t>
+      </w:r>
     </w:p>
     <w:p>
       <w:pPr>
@@ -3265,7 +2959,6 @@
           <w:szCs w:val="36"/>
         </w:rPr>
       </w:pPr>
-      <w:proofErr w:type="spellStart"/>
       <w:r>
         <w:rPr>
           <w:rFonts w:ascii="Courier New" w:eastAsia="Times New Roman" w:hAnsi="Courier New" w:cs="Courier New"/>
@@ -3276,7 +2969,6 @@
         </w:rPr>
         <w:t>package.json</w:t>
       </w:r>
-      <w:proofErr w:type="spellEnd"/>
     </w:p>
     <w:p>
       <w:pPr>
@@ -3402,7 +3094,6 @@
           <w:szCs w:val="36"/>
         </w:rPr>
       </w:pPr>
-      <w:proofErr w:type="gramStart"/>
       <w:r>
         <w:rPr>
           <w:rFonts w:ascii="Courier New" w:eastAsia="Times New Roman" w:hAnsi="Courier New" w:cs="Courier New"/>
@@ -3411,31 +3102,17 @@
           <w:kern w:val="0"/>
           <w:sz w:val="20"/>
         </w:rPr>
-        <w:t>package-</w:t>
-      </w:r>
-      <w:proofErr w:type="spellStart"/>
-      <w:r>
-        <w:rPr>
-          <w:rFonts w:ascii="Courier New" w:eastAsia="Times New Roman" w:hAnsi="Courier New" w:cs="Courier New"/>
-          <w:b/>
-          <w:bCs/>
-          <w:kern w:val="0"/>
-          <w:sz w:val="20"/>
-        </w:rPr>
-        <w:t>lock.json</w:t>
-      </w:r>
-      <w:proofErr w:type="spellEnd"/>
-      <w:proofErr w:type="gramEnd"/>
-    </w:p>
-    <w:p>
-      <w:pPr>
-        <w:spacing w:before="100" w:beforeAutospacing="1" w:after="100" w:afterAutospacing="1" w:line="240" w:lineRule="auto"/>
-        <w:rPr>
-          <w:rFonts w:ascii="Times New Roman" w:eastAsia="Times New Roman" w:hAnsi="Times New Roman" w:cs="Times New Roman"/>
-          <w:kern w:val="0"/>
-        </w:rPr>
-      </w:pPr>
-      <w:proofErr w:type="gramStart"/>
+        <w:t>package-lock.json</w:t>
+      </w:r>
+    </w:p>
+    <w:p>
+      <w:pPr>
+        <w:spacing w:before="100" w:beforeAutospacing="1" w:after="100" w:afterAutospacing="1" w:line="240" w:lineRule="auto"/>
+        <w:rPr>
+          <w:rFonts w:ascii="Times New Roman" w:eastAsia="Times New Roman" w:hAnsi="Times New Roman" w:cs="Times New Roman"/>
+          <w:kern w:val="0"/>
+        </w:rPr>
+      </w:pPr>
       <w:r>
         <w:rPr>
           <w:rFonts w:ascii="Times New Roman" w:eastAsia="Times New Roman" w:hAnsi="Times New Roman" w:cs="Times New Roman"/>
@@ -3443,7 +3120,6 @@
         </w:rPr>
         <w:t>Locks dependency versions to ensure consistent installations across environments.</w:t>
       </w:r>
-      <w:proofErr w:type="gramEnd"/>
     </w:p>
     <w:p>
       <w:pPr>
@@ -6662,7 +6338,7 @@
   <a:extraClrSchemeLst/>
   <a:extLst>
     <a:ext uri="{05A4C25C-085E-4340-85A3-A5531E510DB2}">
-      <thm15:themeFamily xmlns:thm15="http://schemas.microsoft.com/office/thememl/2012/main" xmlns="" name="Office Theme" id="{62F939B6-93AF-4DB8-9C6B-D6C7DFDC589F}" vid="{4A3C46E8-61CC-4603-A589-7422A47A8E4A}"/>
+      <thm15:themeFamily xmlns="" xmlns:thm15="http://schemas.microsoft.com/office/thememl/2012/main" name="Office Theme" id="{62F939B6-93AF-4DB8-9C6B-D6C7DFDC589F}" vid="{4A3C46E8-61CC-4603-A589-7422A47A8E4A}"/>
     </a:ext>
   </a:extLst>
 </a:theme>

</xml_diff>